<commit_message>
Detailed click-by-click laptop PostgreSQL guide
</commit_message>
<xml_diff>
--- a/INSTRUKTSIYA-PostgreSQL-notebook.docx
+++ b/INSTRUKTSIYA-PostgreSQL-notebook.docx
@@ -7,41 +7,112 @@
         <w:pStyle w:val="Title"/>
       </w:pPr>
       <w:r>
-        <w:t>PostgreSQL на ноутбуке для сайта ОПП</w:t>
+        <w:t>Подробная установка PostgreSQL на ноутбук и связь с сайтом ОПП</w:t>
       </w:r>
     </w:p>
     <w:p>
+      <w:pPr>
+        <w:spacing w:after="120"/>
+      </w:pPr>
+      <w:r>
+        <w:rPr>
+          <w:rFonts w:ascii="Calibri" w:hAnsi="Calibri"/>
+          <w:b w:val="0"/>
+          <w:sz w:val="24"/>
+        </w:rPr>
+        <w:t>Цель: результаты теста всех студентов пишутся в одну базу на вашем ноутбуке. Вы открываете админку — видите всех. Excel качается из этой же таблицы.</w:t>
+      </w:r>
+    </w:p>
+    <w:p>
+      <w:pPr>
+        <w:spacing w:after="120"/>
+      </w:pPr>
+      <w:r>
+        <w:rPr>
+          <w:rFonts w:ascii="Calibri" w:hAnsi="Calibri"/>
+          <w:b w:val="0"/>
+          <w:sz w:val="24"/>
+        </w:rPr>
+        <w:t>Делать нужно один раз. Потом перед занятием только запускаете одну команду.</w:t>
+      </w:r>
+    </w:p>
+    <w:p>
+      <w:pPr>
+        <w:pStyle w:val="Heading1"/>
+      </w:pPr>
+      <w:r>
+        <w:t>Что получится в конце</w:t>
+      </w:r>
+    </w:p>
+    <w:p>
+      <w:pPr>
+        <w:spacing w:after="120"/>
+      </w:pPr>
+      <w:r>
+        <w:rPr>
+          <w:rFonts w:ascii="Calibri" w:hAnsi="Calibri"/>
+          <w:b w:val="0"/>
+          <w:sz w:val="24"/>
+        </w:rPr>
+        <w:t>На ноутбуке работают две программы:</w:t>
+      </w:r>
+    </w:p>
+    <w:p>
+      <w:pPr>
+        <w:pStyle w:val="ListBullet"/>
+      </w:pPr>
       <w:r>
         <w:rPr>
           <w:rFonts w:ascii="Calibri" w:hAnsi="Calibri"/>
           <w:sz w:val="24"/>
         </w:rPr>
-        <w:t>Браузер не умеет писать в базу напрямую. На ноутбуке ставятся две вещи: PostgreSQL (склад результатов) и маленький сервер (переводчик между сайтом и базой). Сайт открываете не с GitHub, а с этого сервера — тогда все компьютеры в аудитории, если зайдут на ваш ноутбук, пишут в одну таблицу.</w:t>
+        <w:t>PostgreSQL — склад. Сам по себе сайт не показывает, только хранит строки: ФИО, группа, процент.</w:t>
       </w:r>
     </w:p>
     <w:p>
       <w:pPr>
-        <w:pStyle w:val="Heading1"/>
-      </w:pPr>
-      <w:r>
-        <w:t>Схема</w:t>
-      </w:r>
-    </w:p>
-    <w:p>
+        <w:pStyle w:val="ListBullet"/>
+      </w:pPr>
       <w:r>
         <w:rPr>
           <w:rFonts w:ascii="Calibri" w:hAnsi="Calibri"/>
           <w:sz w:val="24"/>
         </w:rPr>
-        <w:t>Студент → сайт на ноутбуке (порт 8787) → server.js → PostgreSQL (порт 5432) → таблица quiz_results. Админка читает ту же таблицу и сохраняет Excel.</w:t>
+        <w:t>server.js (через Node.js) — касса. Отдаёт страницы сайта и принимает результаты, кладёт их в склад.</w:t>
       </w:r>
     </w:p>
     <w:p>
       <w:pPr>
+        <w:spacing w:after="120"/>
+      </w:pPr>
+      <w:r>
+        <w:rPr>
+          <w:rFonts w:ascii="Calibri" w:hAnsi="Calibri"/>
+          <w:b w:val="0"/>
+          <w:sz w:val="24"/>
+        </w:rPr>
+        <w:t>Студент в браузере открывает адрес вашего ноутбука. Браузер НЕ ходит в базу напрямую — только на кассу. Так безопаснее.</w:t>
+      </w:r>
+    </w:p>
+    <w:p>
+      <w:pPr>
         <w:pStyle w:val="Heading1"/>
       </w:pPr>
       <w:r>
-        <w:t>Что скачать заранее</w:t>
+        <w:t>Часть 0. Что скачать (два файла + zip сайта)</w:t>
+      </w:r>
+    </w:p>
+    <w:p>
+      <w:pPr>
+        <w:spacing w:after="120"/>
+      </w:pPr>
+      <w:r>
+        <w:rPr>
+          <w:rFonts w:ascii="Calibri" w:hAnsi="Calibri"/>
+          <w:b w:val="0"/>
+          <w:sz w:val="24"/>
+        </w:rPr>
+        <w:t>Скачивайте установщики, не «портативные zip», если не уверены.</w:t>
       </w:r>
     </w:p>
     <w:p>
@@ -53,7 +124,7 @@
           <w:rFonts w:ascii="Calibri" w:hAnsi="Calibri"/>
           <w:sz w:val="24"/>
         </w:rPr>
-        <w:t>PostgreSQL для Windows: https://www.postgresql.org/download/windows/  (установщик EDB). Берите версию 16.</w:t>
+        <w:t>PostgreSQL 16 для Windows: https://www.postgresql.org/download/windows/  → кнопка Download the installer → Windows x86-64. Файл вида postgresql-16.x-windows-x64.exe (около 300 МБ).</w:t>
       </w:r>
     </w:p>
     <w:p>
@@ -65,7 +136,7 @@
           <w:rFonts w:ascii="Calibri" w:hAnsi="Calibri"/>
           <w:sz w:val="24"/>
         </w:rPr>
-        <w:t>Node.js LTS: https://nodejs.org/  (кнопка LTS). Это нужно, чтобы запустить server.js.</w:t>
+        <w:t>Node.js LTS: https://nodejs.org/ru  → большая зелёная кнопка LTS (например 22.x). Файл node-v22.x-x64.msi.</w:t>
       </w:r>
     </w:p>
     <w:p>
@@ -77,15 +148,36 @@
           <w:rFonts w:ascii="Calibri" w:hAnsi="Calibri"/>
           <w:sz w:val="24"/>
         </w:rPr>
-        <w:t>Папку сайта ОПП (zip с server.js, index.html, app.js и остальным).</w:t>
+        <w:t>Комплект сайта: opp-postgresql-noutbuk.zip (рядом с этой инструкцией).</w:t>
       </w:r>
     </w:p>
     <w:p>
       <w:pPr>
+        <w:spacing w:after="120"/>
+      </w:pPr>
+      <w:r>
+        <w:rPr>
+          <w:rFonts w:ascii="Calibri" w:hAnsi="Calibri"/>
+          <w:b w:val="0"/>
+          <w:sz w:val="24"/>
+        </w:rPr>
+        <w:t>Антивирус может ругаться на установщик PostgreSQL — это известный ложный плюс. Разрешите, если качали с postgresql.org.</w:t>
+      </w:r>
+    </w:p>
+    <w:p>
+      <w:pPr>
         <w:pStyle w:val="Heading1"/>
       </w:pPr>
       <w:r>
-        <w:t>Шаг 1. Установить PostgreSQL</w:t>
+        <w:t>Часть 1. Установка PostgreSQL — экран за экраном</w:t>
+      </w:r>
+    </w:p>
+    <w:p>
+      <w:pPr>
+        <w:pStyle w:val="Heading2"/>
+      </w:pPr>
+      <w:r>
+        <w:t>1.1. Запуск установщика</w:t>
       </w:r>
     </w:p>
     <w:p>
@@ -97,7 +189,7 @@
           <w:rFonts w:ascii="Calibri" w:hAnsi="Calibri"/>
           <w:sz w:val="24"/>
         </w:rPr>
-        <w:t>Запустите установщик. Все галочки можно оставить как есть. pgAdmin — оставьте, он пригодится.</w:t>
+        <w:t>Двойной щелчок по скачанному .exe. Если Windows спросит «Разрешить этому приложению вносить изменения?» — Да.</w:t>
       </w:r>
     </w:p>
     <w:p>
@@ -109,127 +201,645 @@
           <w:rFonts w:ascii="Calibri" w:hAnsi="Calibri"/>
           <w:sz w:val="24"/>
         </w:rPr>
-        <w:t>Когда спросят пароль пользователя postgres — придумайте и ЗАПИШИТЕ. Это главный пароль базы. Пример: Opp2026*</w:t>
+        <w:t>Язык мастера можно оставить English. На смысл кнопок это не влияет: Next / Finish.</w:t>
       </w:r>
     </w:p>
     <w:p>
       <w:pPr>
-        <w:pStyle w:val="ListNumber"/>
+        <w:pStyle w:val="Heading2"/>
+      </w:pPr>
+      <w:r>
+        <w:t>1.2. Папка установки</w:t>
+      </w:r>
+    </w:p>
+    <w:p>
+      <w:pPr>
+        <w:spacing w:after="120"/>
+      </w:pPr>
+      <w:r>
+        <w:rPr>
+          <w:rFonts w:ascii="Calibri" w:hAnsi="Calibri"/>
+          <w:b w:val="0"/>
+          <w:sz w:val="24"/>
+        </w:rPr>
+        <w:t>Setup Wizard → Next. Installation Directory оставьте:</w:t>
+      </w:r>
+    </w:p>
+    <w:p>
+      <w:pPr>
+        <w:spacing w:after="160"/>
+      </w:pPr>
+      <w:r>
+        <w:rPr>
+          <w:rFonts w:ascii="Consolas" w:hAnsi="Consolas"/>
+          <w:sz w:val="20"/>
+        </w:rPr>
+        <w:t>C:\Program Files\PostgreSQL\16</w:t>
+      </w:r>
+    </w:p>
+    <w:p>
+      <w:pPr>
+        <w:spacing w:after="120"/>
+      </w:pPr>
+      <w:r>
+        <w:rPr>
+          <w:rFonts w:ascii="Calibri" w:hAnsi="Calibri"/>
+          <w:b w:val="0"/>
+          <w:sz w:val="24"/>
+        </w:rPr>
+        <w:t>Next.</w:t>
+      </w:r>
+    </w:p>
+    <w:p>
+      <w:pPr>
+        <w:pStyle w:val="Heading2"/>
+      </w:pPr>
+      <w:r>
+        <w:t>1.3. Какие компоненты ставить</w:t>
+      </w:r>
+    </w:p>
+    <w:p>
+      <w:pPr>
+        <w:spacing w:after="120"/>
+      </w:pPr>
+      <w:r>
+        <w:rPr>
+          <w:rFonts w:ascii="Calibri" w:hAnsi="Calibri"/>
+          <w:b w:val="0"/>
+          <w:sz w:val="24"/>
+        </w:rPr>
+        <w:t>Галочки (Select Components):</w:t>
+      </w:r>
+    </w:p>
+    <w:p>
+      <w:pPr>
+        <w:pStyle w:val="ListBullet"/>
       </w:pPr>
       <w:r>
         <w:rPr>
           <w:rFonts w:ascii="Calibri" w:hAnsi="Calibri"/>
           <w:sz w:val="24"/>
         </w:rPr>
-        <w:t>Порт оставьте 5432. Locale — Russian, Russia или по умолчанию.</w:t>
+        <w:t>PostgreSQL Server — ОБЯЗАТЕЛЬНО (сама база).</w:t>
       </w:r>
     </w:p>
     <w:p>
       <w:pPr>
-        <w:pStyle w:val="ListNumber"/>
+        <w:pStyle w:val="ListBullet"/>
       </w:pPr>
       <w:r>
         <w:rPr>
           <w:rFonts w:ascii="Calibri" w:hAnsi="Calibri"/>
           <w:sz w:val="24"/>
         </w:rPr>
-        <w:t>Stack Builder в конце можно закрыть (Cancel) — дополнительные пакеты не нужны.</w:t>
+        <w:t>pgAdmin 4 — ОБЯЗАТЕЛЬНО (окошко, где видно таблицы).</w:t>
       </w:r>
     </w:p>
     <w:p>
       <w:pPr>
-        <w:pStyle w:val="ListNumber"/>
+        <w:pStyle w:val="ListBullet"/>
       </w:pPr>
       <w:r>
         <w:rPr>
           <w:rFonts w:ascii="Calibri" w:hAnsi="Calibri"/>
           <w:sz w:val="24"/>
         </w:rPr>
-        <w:t>Проверка: в меню Пуск найдите «SQL Shell (psql)» или pgAdmin 4. Если открывается — служба базы работает.</w:t>
+        <w:t>Stack Builder — можно снять галку, не нужен.</w:t>
       </w:r>
     </w:p>
     <w:p>
       <w:pPr>
-        <w:pStyle w:val="Heading1"/>
-      </w:pPr>
-      <w:r>
-        <w:t>Шаг 2. Создать базу opp</w:t>
-      </w:r>
-    </w:p>
-    <w:p>
+        <w:pStyle w:val="ListBullet"/>
+      </w:pPr>
       <w:r>
         <w:rPr>
           <w:rFonts w:ascii="Calibri" w:hAnsi="Calibri"/>
           <w:sz w:val="24"/>
         </w:rPr>
-        <w:t>Откройте «SQL Shell (psql)». Несколько раз Enter (сервер localhost, порт 5432, база postgres, пользователь postgres), затем введите пароль из шага 1. Дальше скопируйте по одной команде:</w:t>
+        <w:t>Command Line Tools — оставьте (программа psql).</w:t>
       </w:r>
     </w:p>
     <w:p>
+      <w:pPr>
+        <w:spacing w:after="120"/>
+      </w:pPr>
+      <w:r>
+        <w:rPr>
+          <w:rFonts w:ascii="Calibri" w:hAnsi="Calibri"/>
+          <w:b w:val="0"/>
+          <w:sz w:val="24"/>
+        </w:rPr>
+        <w:t>Next.</w:t>
+      </w:r>
+    </w:p>
+    <w:p>
+      <w:pPr>
+        <w:pStyle w:val="Heading2"/>
+      </w:pPr>
+      <w:r>
+        <w:t>1.4. Где лежат данные базы</w:t>
+      </w:r>
+    </w:p>
+    <w:p>
+      <w:pPr>
+        <w:spacing w:after="120"/>
+      </w:pPr>
+      <w:r>
+        <w:rPr>
+          <w:rFonts w:ascii="Calibri" w:hAnsi="Calibri"/>
+          <w:b w:val="0"/>
+          <w:sz w:val="24"/>
+        </w:rPr>
+        <w:t>Data Directory оставьте как предлагает, обычно:</w:t>
+      </w:r>
+    </w:p>
+    <w:p>
+      <w:pPr>
+        <w:spacing w:after="160"/>
+      </w:pPr>
+      <w:r>
+        <w:rPr>
+          <w:rFonts w:ascii="Consolas" w:hAnsi="Consolas"/>
+          <w:sz w:val="20"/>
+        </w:rPr>
+        <w:t>C:\Program Files\PostgreSQL\16\data</w:t>
+      </w:r>
+    </w:p>
+    <w:p>
+      <w:pPr>
+        <w:spacing w:after="120"/>
+      </w:pPr>
+      <w:r>
+        <w:rPr>
+          <w:rFonts w:ascii="Calibri" w:hAnsi="Calibri"/>
+          <w:b w:val="0"/>
+          <w:sz w:val="24"/>
+        </w:rPr>
+        <w:t>Next. Эту папку руками не чистите.</w:t>
+      </w:r>
+    </w:p>
+    <w:p>
+      <w:pPr>
+        <w:pStyle w:val="Heading2"/>
+      </w:pPr>
+      <w:r>
+        <w:t>1.5. Пароль — самый важный экран</w:t>
+      </w:r>
+    </w:p>
+    <w:p>
+      <w:pPr>
+        <w:spacing w:after="120"/>
+      </w:pPr>
+      <w:r>
+        <w:rPr>
+          <w:rFonts w:ascii="Calibri" w:hAnsi="Calibri"/>
+          <w:b w:val="0"/>
+          <w:sz w:val="24"/>
+        </w:rPr>
+        <w:t>Password. Это пароль пользователя postgres (главный вход в базу).</w:t>
+      </w:r>
+    </w:p>
+    <w:p>
+      <w:pPr>
+        <w:pStyle w:val="ListBullet"/>
+      </w:pPr>
+      <w:r>
+        <w:rPr>
+          <w:rFonts w:ascii="Calibri" w:hAnsi="Calibri"/>
+          <w:sz w:val="24"/>
+        </w:rPr>
+        <w:t>Придумайте пароль и запишите в тетрадь / в телефон. Без него сайт к базе не подключится.</w:t>
+      </w:r>
+    </w:p>
+    <w:p>
+      <w:pPr>
+        <w:pStyle w:val="ListBullet"/>
+      </w:pPr>
+      <w:r>
+        <w:rPr>
+          <w:rFonts w:ascii="Calibri" w:hAnsi="Calibri"/>
+          <w:sz w:val="24"/>
+        </w:rPr>
+        <w:t>Пример, который легко не забыть, но не «123»: Opp2026*</w:t>
+      </w:r>
+    </w:p>
+    <w:p>
+      <w:pPr>
+        <w:pStyle w:val="ListBullet"/>
+      </w:pPr>
+      <w:r>
+        <w:rPr>
+          <w:rFonts w:ascii="Calibri" w:hAnsi="Calibri"/>
+          <w:sz w:val="24"/>
+        </w:rPr>
+        <w:t>Введите два раза одинаково.</w:t>
+      </w:r>
+    </w:p>
+    <w:p>
+      <w:pPr>
+        <w:pStyle w:val="ListBullet"/>
+      </w:pPr>
+      <w:r>
+        <w:rPr>
+          <w:rFonts w:ascii="Calibri" w:hAnsi="Calibri"/>
+          <w:sz w:val="24"/>
+        </w:rPr>
+        <w:t>Не ставьте пустой пароль.</w:t>
+      </w:r>
+    </w:p>
+    <w:p>
+      <w:pPr>
+        <w:spacing w:after="120"/>
+      </w:pPr>
+      <w:r>
+        <w:rPr>
+          <w:rFonts w:ascii="Calibri" w:hAnsi="Calibri"/>
+          <w:b w:val="0"/>
+          <w:sz w:val="24"/>
+        </w:rPr>
+        <w:t>Next.</w:t>
+      </w:r>
+    </w:p>
+    <w:p>
+      <w:pPr>
+        <w:pStyle w:val="Heading2"/>
+      </w:pPr>
+      <w:r>
+        <w:t>1.6. Порт</w:t>
+      </w:r>
+    </w:p>
+    <w:p>
+      <w:pPr>
+        <w:spacing w:after="120"/>
+      </w:pPr>
+      <w:r>
+        <w:rPr>
+          <w:rFonts w:ascii="Calibri" w:hAnsi="Calibri"/>
+          <w:b w:val="0"/>
+          <w:sz w:val="24"/>
+        </w:rPr>
+        <w:t>Port: 5432. Не меняйте. Это «номер кабинета» базы на ноутбуке. Next.</w:t>
+      </w:r>
+    </w:p>
+    <w:p>
+      <w:pPr>
+        <w:pStyle w:val="Heading2"/>
+      </w:pPr>
+      <w:r>
+        <w:t>1.7. Язык базы</w:t>
+      </w:r>
+    </w:p>
+    <w:p>
+      <w:pPr>
+        <w:spacing w:after="120"/>
+      </w:pPr>
+      <w:r>
+        <w:rPr>
+          <w:rFonts w:ascii="Calibri" w:hAnsi="Calibri"/>
+          <w:b w:val="0"/>
+          <w:sz w:val="24"/>
+        </w:rPr>
+        <w:t>Locale: можно Default locale или Russian, Russia. Next.</w:t>
+      </w:r>
+    </w:p>
+    <w:p>
+      <w:pPr>
+        <w:pStyle w:val="Heading2"/>
+      </w:pPr>
+      <w:r>
+        <w:t>1.8. Pre Installation Summary и установка</w:t>
+      </w:r>
+    </w:p>
+    <w:p>
+      <w:pPr>
+        <w:pStyle w:val="ListNumber"/>
+      </w:pPr>
+      <w:r>
+        <w:rPr>
+          <w:rFonts w:ascii="Calibri" w:hAnsi="Calibri"/>
+          <w:sz w:val="24"/>
+        </w:rPr>
+        <w:t>Next → Next. Пойдёт копирование файлов, 1–3 минуты.</w:t>
+      </w:r>
+    </w:p>
+    <w:p>
+      <w:pPr>
+        <w:pStyle w:val="ListNumber"/>
+      </w:pPr>
+      <w:r>
+        <w:rPr>
+          <w:rFonts w:ascii="Calibri" w:hAnsi="Calibri"/>
+          <w:sz w:val="24"/>
+        </w:rPr>
+        <w:t>В конце окно Completing the PostgreSQL Setup. Если есть галка Launch Stack Builder — снимите. Finish.</w:t>
+      </w:r>
+    </w:p>
+    <w:p>
+      <w:pPr>
+        <w:pStyle w:val="Heading2"/>
+      </w:pPr>
+      <w:r>
+        <w:t>1.9. Проверка, что служба жива</w:t>
+      </w:r>
+    </w:p>
+    <w:p>
+      <w:pPr>
+        <w:pStyle w:val="ListNumber"/>
+      </w:pPr>
+      <w:r>
+        <w:rPr>
+          <w:rFonts w:ascii="Calibri" w:hAnsi="Calibri"/>
+          <w:sz w:val="24"/>
+        </w:rPr>
+        <w:t>Клавиша Win, наберите services.msc, Enter.</w:t>
+      </w:r>
+    </w:p>
+    <w:p>
+      <w:pPr>
+        <w:pStyle w:val="ListNumber"/>
+      </w:pPr>
+      <w:r>
+        <w:rPr>
+          <w:rFonts w:ascii="Calibri" w:hAnsi="Calibri"/>
+          <w:sz w:val="24"/>
+        </w:rPr>
+        <w:t>В списке найдите postgresql-x64-16 (имя может быть postgresql-x64-16 - PostgreSQL Server 16).</w:t>
+      </w:r>
+    </w:p>
+    <w:p>
+      <w:pPr>
+        <w:pStyle w:val="ListNumber"/>
+      </w:pPr>
+      <w:r>
+        <w:rPr>
+          <w:rFonts w:ascii="Calibri" w:hAnsi="Calibri"/>
+          <w:sz w:val="24"/>
+        </w:rPr>
+        <w:t>Состояние должно быть «Выполняется» / Running. Если нет — правая кнопка → Запустить.</w:t>
+      </w:r>
+    </w:p>
+    <w:p>
+      <w:pPr>
+        <w:pStyle w:val="ListNumber"/>
+      </w:pPr>
+      <w:r>
+        <w:rPr>
+          <w:rFonts w:ascii="Calibri" w:hAnsi="Calibri"/>
+          <w:sz w:val="24"/>
+        </w:rPr>
+        <w:t>Дополнительно: Пуск → pgAdmin 4. Первый запуск минуту думает. Откроется браузер с деревом слева: Servers → PostgreSQL 16. Пароль — тот, что в п. 1.5.</w:t>
+      </w:r>
+    </w:p>
+    <w:p>
+      <w:pPr>
+        <w:spacing w:after="120"/>
+      </w:pPr>
+      <w:r>
+        <w:rPr>
+          <w:rFonts w:ascii="Calibri" w:hAnsi="Calibri"/>
+          <w:b w:val="0"/>
+          <w:sz w:val="24"/>
+        </w:rPr>
+        <w:t>Если pgAdmin просит Master Password — это УЖЕ пароль самого pgAdmin (можно тот же Opp2026*). Потом ещё раз спросит пароль сервера postgres — тоже из п. 1.5.</w:t>
+      </w:r>
+    </w:p>
+    <w:p>
+      <w:pPr>
+        <w:pStyle w:val="Heading1"/>
+      </w:pPr>
+      <w:r>
+        <w:t>Часть 2. Создать пустую базу с именем opp</w:t>
+      </w:r>
+    </w:p>
+    <w:p>
+      <w:pPr>
+        <w:spacing w:after="120"/>
+      </w:pPr>
+      <w:r>
+        <w:rPr>
+          <w:rFonts w:ascii="Calibri" w:hAnsi="Calibri"/>
+          <w:b w:val="0"/>
+          <w:sz w:val="24"/>
+        </w:rPr>
+        <w:t>База «postgres» служебная. Нам отдельная — opp.</w:t>
+      </w:r>
+    </w:p>
+    <w:p>
+      <w:pPr>
+        <w:pStyle w:val="Heading2"/>
+      </w:pPr>
+      <w:r>
+        <w:t>2.1. Через pgAdmin (мышкой, проще)</w:t>
+      </w:r>
+    </w:p>
+    <w:p>
+      <w:pPr>
+        <w:pStyle w:val="ListNumber"/>
+      </w:pPr>
+      <w:r>
+        <w:rPr>
+          <w:rFonts w:ascii="Calibri" w:hAnsi="Calibri"/>
+          <w:sz w:val="24"/>
+        </w:rPr>
+        <w:t>Слева раскройте Servers → PostgreSQL 16 (введите пароль, если спросит).</w:t>
+      </w:r>
+    </w:p>
+    <w:p>
+      <w:pPr>
+        <w:pStyle w:val="ListNumber"/>
+      </w:pPr>
+      <w:r>
+        <w:rPr>
+          <w:rFonts w:ascii="Calibri" w:hAnsi="Calibri"/>
+          <w:sz w:val="24"/>
+        </w:rPr>
+        <w:t>Правая кнопка по папке Databases → Create → Database…</w:t>
+      </w:r>
+    </w:p>
+    <w:p>
+      <w:pPr>
+        <w:pStyle w:val="ListNumber"/>
+      </w:pPr>
+      <w:r>
+        <w:rPr>
+          <w:rFonts w:ascii="Calibri" w:hAnsi="Calibri"/>
+          <w:sz w:val="24"/>
+        </w:rPr>
+        <w:t>Вкладка General, поле Database: напишите ровно opp (латиницей, маленькими).</w:t>
+      </w:r>
+    </w:p>
+    <w:p>
+      <w:pPr>
+        <w:pStyle w:val="ListNumber"/>
+      </w:pPr>
+      <w:r>
+        <w:rPr>
+          <w:rFonts w:ascii="Calibri" w:hAnsi="Calibri"/>
+          <w:sz w:val="24"/>
+        </w:rPr>
+        <w:t>Owner: postgres.</w:t>
+      </w:r>
+    </w:p>
+    <w:p>
+      <w:pPr>
+        <w:pStyle w:val="ListNumber"/>
+      </w:pPr>
+      <w:r>
+        <w:rPr>
+          <w:rFonts w:ascii="Calibri" w:hAnsi="Calibri"/>
+          <w:sz w:val="24"/>
+        </w:rPr>
+        <w:t>Save / Сохранить.</w:t>
+      </w:r>
+    </w:p>
+    <w:p>
+      <w:pPr>
+        <w:pStyle w:val="ListNumber"/>
+      </w:pPr>
+      <w:r>
+        <w:rPr>
+          <w:rFonts w:ascii="Calibri" w:hAnsi="Calibri"/>
+          <w:sz w:val="24"/>
+        </w:rPr>
+        <w:t>В списке Databases должна появиться opp.</w:t>
+      </w:r>
+    </w:p>
+    <w:p>
+      <w:pPr>
+        <w:pStyle w:val="Heading2"/>
+      </w:pPr>
+      <w:r>
+        <w:t>2.2. Через чёрное окно psql (если pgAdmin капризничает)</w:t>
+      </w:r>
+    </w:p>
+    <w:p>
+      <w:pPr>
+        <w:pStyle w:val="ListNumber"/>
+      </w:pPr>
+      <w:r>
+        <w:rPr>
+          <w:rFonts w:ascii="Calibri" w:hAnsi="Calibri"/>
+          <w:sz w:val="24"/>
+        </w:rPr>
+        <w:t>Пуск → SQL Shell (psql).</w:t>
+      </w:r>
+    </w:p>
+    <w:p>
+      <w:pPr>
+        <w:pStyle w:val="ListNumber"/>
+      </w:pPr>
+      <w:r>
+        <w:rPr>
+          <w:rFonts w:ascii="Calibri" w:hAnsi="Calibri"/>
+          <w:sz w:val="24"/>
+        </w:rPr>
+        <w:t>Первые вопросы — просто Enter: Server [localhost], Database [postgres], Port [5432], Username [postgres].</w:t>
+      </w:r>
+    </w:p>
+    <w:p>
+      <w:pPr>
+        <w:pStyle w:val="ListNumber"/>
+      </w:pPr>
+      <w:r>
+        <w:rPr>
+          <w:rFonts w:ascii="Calibri" w:hAnsi="Calibri"/>
+          <w:sz w:val="24"/>
+        </w:rPr>
+        <w:t>Password — вводите пароль из п. 1.5. Курсор не двигается, это нормально. Enter.</w:t>
+      </w:r>
+    </w:p>
+    <w:p>
+      <w:pPr>
+        <w:pStyle w:val="ListNumber"/>
+      </w:pPr>
+      <w:r>
+        <w:rPr>
+          <w:rFonts w:ascii="Calibri" w:hAnsi="Calibri"/>
+          <w:sz w:val="24"/>
+        </w:rPr>
+        <w:t>Появится приглашение postgres=#</w:t>
+      </w:r>
+    </w:p>
+    <w:p>
+      <w:pPr>
+        <w:spacing w:after="120"/>
+      </w:pPr>
+      <w:r>
+        <w:rPr>
+          <w:rFonts w:ascii="Calibri" w:hAnsi="Calibri"/>
+          <w:b w:val="0"/>
+          <w:sz w:val="24"/>
+        </w:rPr>
+        <w:t>Наберите и нажмите Enter:</w:t>
+      </w:r>
+    </w:p>
+    <w:p>
+      <w:pPr>
+        <w:spacing w:after="160"/>
+      </w:pPr>
       <w:r>
         <w:rPr>
           <w:rFonts w:ascii="Consolas" w:hAnsi="Consolas"/>
           <w:sz w:val="20"/>
         </w:rPr>
         <w:t>CREATE DATABASE opp;</w:t>
-        <w:br/>
-        <w:t>\c opp</w:t>
-        <w:br/>
-        <w:t>CREATE TABLE IF NOT EXISTS quiz_results (</w:t>
-        <w:br/>
-        <w:t xml:space="preserve">  id SERIAL PRIMARY KEY,</w:t>
-        <w:br/>
-        <w:t xml:space="preserve">  taken_at TEXT NOT NULL,</w:t>
-        <w:br/>
-        <w:t xml:space="preserve">  student_name TEXT NOT NULL,</w:t>
-        <w:br/>
-        <w:t xml:space="preserve">  group_code TEXT NOT NULL,</w:t>
-        <w:br/>
-        <w:t xml:space="preserve">  module_id TEXT NOT NULL DEFAULT '1',</w:t>
-        <w:br/>
-        <w:t xml:space="preserve">  status TEXT NOT NULL,</w:t>
-        <w:br/>
-        <w:t xml:space="preserve">  correct INTEGER NOT NULL DEFAULT 0,</w:t>
-        <w:br/>
-        <w:t xml:space="preserve">  total INTEGER NOT NULL DEFAULT 0,</w:t>
-        <w:br/>
-        <w:t xml:space="preserve">  pct INTEGER NOT NULL DEFAULT 0,</w:t>
-        <w:br/>
-        <w:t xml:space="preserve">  xp INTEGER NOT NULL DEFAULT 0,</w:t>
-        <w:br/>
-        <w:t xml:space="preserve">  duration_sec INTEGER NOT NULL DEFAULT 0,</w:t>
-        <w:br/>
-        <w:t xml:space="preserve">  created_at TIMESTAMPTZ NOT NULL DEFAULT now()</w:t>
-        <w:br/>
-        <w:t>);</w:t>
-        <w:br/>
+      </w:r>
+    </w:p>
+    <w:p>
+      <w:pPr>
+        <w:spacing w:after="120"/>
+      </w:pPr>
+      <w:r>
+        <w:rPr>
+          <w:rFonts w:ascii="Calibri" w:hAnsi="Calibri"/>
+          <w:b w:val="0"/>
+          <w:sz w:val="24"/>
+        </w:rPr>
+        <w:t>Должно ответить CREATE DATABASE. Выход:</w:t>
+      </w:r>
+    </w:p>
+    <w:p>
+      <w:pPr>
+        <w:spacing w:after="160"/>
+      </w:pPr>
+      <w:r>
+        <w:rPr>
+          <w:rFonts w:ascii="Consolas" w:hAnsi="Consolas"/>
+          <w:sz w:val="20"/>
+        </w:rPr>
         <w:t>\q</w:t>
       </w:r>
     </w:p>
     <w:p>
+      <w:pPr>
+        <w:pStyle w:val="Heading1"/>
+      </w:pPr>
+      <w:r>
+        <w:t>Часть 3. Установка Node.js</w:t>
+      </w:r>
+    </w:p>
+    <w:p>
+      <w:pPr>
+        <w:pStyle w:val="ListNumber"/>
+      </w:pPr>
       <w:r>
         <w:rPr>
           <w:rFonts w:ascii="Calibri" w:hAnsi="Calibri"/>
           <w:sz w:val="24"/>
         </w:rPr>
-        <w:t>Таблицы также создаст сам server.js при первом запуске, если пользователь postgres может писать в базу opp. Команды выше — запасной путь.</w:t>
+        <w:t>Двойной щелчок по .msi → Next.</w:t>
       </w:r>
     </w:p>
     <w:p>
+      <w:pPr>
+        <w:pStyle w:val="ListNumber"/>
+      </w:pPr>
       <w:r>
         <w:rPr>
           <w:rFonts w:ascii="Calibri" w:hAnsi="Calibri"/>
           <w:sz w:val="24"/>
         </w:rPr>
-        <w:t>В pgAdmin: Servers → PostgreSQL 16 → Databases → правая кнопка → Create → Database → имя opp.</w:t>
-      </w:r>
-    </w:p>
-    <w:p>
-      <w:pPr>
-        <w:pStyle w:val="Heading1"/>
-      </w:pPr>
-      <w:r>
-        <w:t>Шаг 3. Настроить папку сайта</w:t>
+        <w:t>Галка I accept → Next.</w:t>
       </w:r>
     </w:p>
     <w:p>
@@ -241,7 +851,7 @@
           <w:rFonts w:ascii="Calibri" w:hAnsi="Calibri"/>
           <w:sz w:val="24"/>
         </w:rPr>
-        <w:t>Распакуйте zip ОПП в папку, например C:\opp-pallet</w:t>
+        <w:t>Путь установки не меняйте.</w:t>
       </w:r>
     </w:p>
     <w:p>
@@ -253,7 +863,7 @@
           <w:rFonts w:ascii="Calibri" w:hAnsi="Calibri"/>
           <w:sz w:val="24"/>
         </w:rPr>
-        <w:t>Скопируйте файл db-config.example.json → переименуйте копию в db-config.json</w:t>
+        <w:t>На экране Custom Setup все галки оставьте (npm должен быть включён). Next.</w:t>
       </w:r>
     </w:p>
     <w:p>
@@ -265,10 +875,162 @@
           <w:rFonts w:ascii="Calibri" w:hAnsi="Calibri"/>
           <w:sz w:val="24"/>
         </w:rPr>
-        <w:t>Откройте db-config.json блокнотом и вставьте СВОЙ пароль postgres:</w:t>
+        <w:t>Если есть «Automatically install necessary tools» (Build Tools) — можно снять, нам компилятор не нужен.</w:t>
       </w:r>
     </w:p>
     <w:p>
+      <w:pPr>
+        <w:pStyle w:val="ListNumber"/>
+      </w:pPr>
+      <w:r>
+        <w:rPr>
+          <w:rFonts w:ascii="Calibri" w:hAnsi="Calibri"/>
+          <w:sz w:val="24"/>
+        </w:rPr>
+        <w:t>Install → Да на запрос Windows → Finish.</w:t>
+      </w:r>
+    </w:p>
+    <w:p>
+      <w:pPr>
+        <w:pStyle w:val="ListNumber"/>
+      </w:pPr>
+      <w:r>
+        <w:rPr>
+          <w:rFonts w:ascii="Calibri" w:hAnsi="Calibri"/>
+          <w:sz w:val="24"/>
+        </w:rPr>
+        <w:t>Проверка: Пуск → cmd → наберите node -v и Enter. Должно показать v22… Затем npm -v — номер вроде 10.x. Если «не является командой» — закройте cmd и откройте СНОВА (чтобы подхватился PATH), либо перезайдите в Windows.</w:t>
+      </w:r>
+    </w:p>
+    <w:p>
+      <w:pPr>
+        <w:pStyle w:val="Heading1"/>
+      </w:pPr>
+      <w:r>
+        <w:t>Часть 4. Папка сайта</w:t>
+      </w:r>
+    </w:p>
+    <w:p>
+      <w:pPr>
+        <w:pStyle w:val="ListNumber"/>
+      </w:pPr>
+      <w:r>
+        <w:rPr>
+          <w:rFonts w:ascii="Calibri" w:hAnsi="Calibri"/>
+          <w:sz w:val="24"/>
+        </w:rPr>
+        <w:t>Распакуйте opp-postgresql-noutbuk.zip. Лучше в корень диска, путь без пробелов и кириллицы, например C:\opp-pallet</w:t>
+      </w:r>
+    </w:p>
+    <w:p>
+      <w:pPr>
+        <w:pStyle w:val="ListNumber"/>
+      </w:pPr>
+      <w:r>
+        <w:rPr>
+          <w:rFonts w:ascii="Calibri" w:hAnsi="Calibri"/>
+          <w:sz w:val="24"/>
+        </w:rPr>
+        <w:t>Зайдите внутрь: должны лежать index.html, app.js, server.js, package.json, db-config.example.json, synology-config.js и другие.</w:t>
+      </w:r>
+    </w:p>
+    <w:p>
+      <w:pPr>
+        <w:pStyle w:val="ListNumber"/>
+      </w:pPr>
+      <w:r>
+        <w:rPr>
+          <w:rFonts w:ascii="Calibri" w:hAnsi="Calibri"/>
+          <w:sz w:val="24"/>
+        </w:rPr>
+        <w:t>Файл synology-config.js откройте Блокнотом. Должна быть ровно одна рабочая строка:</w:t>
+      </w:r>
+    </w:p>
+    <w:p>
+      <w:pPr>
+        <w:spacing w:after="160"/>
+      </w:pPr>
+      <w:r>
+        <w:rPr>
+          <w:rFonts w:ascii="Consolas" w:hAnsi="Consolas"/>
+          <w:sz w:val="20"/>
+        </w:rPr>
+        <w:t>window.OPP_API = "api.php";</w:t>
+      </w:r>
+    </w:p>
+    <w:p>
+      <w:pPr>
+        <w:spacing w:after="120"/>
+      </w:pPr>
+      <w:r>
+        <w:rPr>
+          <w:rFonts w:ascii="Calibri" w:hAnsi="Calibri"/>
+          <w:b w:val="0"/>
+          <w:sz w:val="24"/>
+        </w:rPr>
+        <w:t>Если там пустые кавычки — сайт не будет стучаться в базу. Исправьте, сохраните.</w:t>
+      </w:r>
+    </w:p>
+    <w:p>
+      <w:pPr>
+        <w:pStyle w:val="Heading1"/>
+      </w:pPr>
+      <w:r>
+        <w:t>Часть 5. Файл пароля db-config.json</w:t>
+      </w:r>
+    </w:p>
+    <w:p>
+      <w:pPr>
+        <w:pStyle w:val="ListNumber"/>
+      </w:pPr>
+      <w:r>
+        <w:rPr>
+          <w:rFonts w:ascii="Calibri" w:hAnsi="Calibri"/>
+          <w:sz w:val="24"/>
+        </w:rPr>
+        <w:t>В папке сайта найдите db-config.example.json.</w:t>
+      </w:r>
+    </w:p>
+    <w:p>
+      <w:pPr>
+        <w:pStyle w:val="ListNumber"/>
+      </w:pPr>
+      <w:r>
+        <w:rPr>
+          <w:rFonts w:ascii="Calibri" w:hAnsi="Calibri"/>
+          <w:sz w:val="24"/>
+        </w:rPr>
+        <w:t>Правая кнопка → Копировать, затем Вставить (появится «db-config.example — копия.json»).</w:t>
+      </w:r>
+    </w:p>
+    <w:p>
+      <w:pPr>
+        <w:pStyle w:val="ListNumber"/>
+      </w:pPr>
+      <w:r>
+        <w:rPr>
+          <w:rFonts w:ascii="Calibri" w:hAnsi="Calibri"/>
+          <w:sz w:val="24"/>
+        </w:rPr>
+        <w:t>Переименуйте копию ТОЧНО в db-config.json (не .txt в конце). Если Windows прячет расширения: Проводник → Вид → Показать → Расширения имён файлов.</w:t>
+      </w:r>
+    </w:p>
+    <w:p>
+      <w:pPr>
+        <w:pStyle w:val="ListNumber"/>
+      </w:pPr>
+      <w:r>
+        <w:rPr>
+          <w:rFonts w:ascii="Calibri" w:hAnsi="Calibri"/>
+          <w:sz w:val="24"/>
+        </w:rPr>
+        <w:t>Откройте db-config.json Блокнотом. Замените пароль на свой из п. 1.5:</w:t>
+      </w:r>
+    </w:p>
+    <w:p>
+      <w:pPr>
+        <w:spacing w:after="160"/>
+      </w:pPr>
       <w:r>
         <w:rPr>
           <w:rFonts w:ascii="Consolas" w:hAnsi="Consolas"/>
@@ -290,75 +1052,321 @@
       </w:r>
     </w:p>
     <w:p>
+      <w:pPr>
+        <w:spacing w:after="120"/>
+      </w:pPr>
+      <w:r>
+        <w:rPr>
+          <w:rFonts w:ascii="Calibri" w:hAnsi="Calibri"/>
+          <w:b w:val="0"/>
+          <w:sz w:val="24"/>
+        </w:rPr>
+        <w:t>Кавычки и запятые не удаляйте. 127.0.0.1 значит «база на этом же ноутбуке». Сохраните (Ctrl+S).</w:t>
+      </w:r>
+    </w:p>
+    <w:p>
+      <w:pPr>
+        <w:pStyle w:val="Heading1"/>
+      </w:pPr>
+      <w:r>
+        <w:t>Часть 6. Первый запуск связи</w:t>
+      </w:r>
+    </w:p>
+    <w:p>
+      <w:pPr>
+        <w:spacing w:after="120"/>
+      </w:pPr>
+      <w:r>
+        <w:rPr>
+          <w:rFonts w:ascii="Calibri" w:hAnsi="Calibri"/>
+          <w:b w:val="0"/>
+          <w:sz w:val="24"/>
+        </w:rPr>
+        <w:t>Откройте командную строку УЖЕ В ПАПКЕ САЙТА:</w:t>
+      </w:r>
+    </w:p>
+    <w:p>
+      <w:pPr>
+        <w:pStyle w:val="ListNumber"/>
+      </w:pPr>
       <w:r>
         <w:rPr>
           <w:rFonts w:ascii="Calibri" w:hAnsi="Calibri"/>
           <w:sz w:val="24"/>
         </w:rPr>
-        <w:t>Файл synology-config.js должен содержать:</w:t>
+        <w:t>В Проводнике откройте C:\opp-pallet</w:t>
       </w:r>
     </w:p>
     <w:p>
-      <w:r>
-        <w:rPr>
-          <w:rFonts w:ascii="Consolas" w:hAnsi="Consolas"/>
-          <w:sz w:val="20"/>
-        </w:rPr>
-        <w:t>window.OPP_API = "api.php";</w:t>
-      </w:r>
-    </w:p>
-    <w:p>
-      <w:pPr>
-        <w:pStyle w:val="Heading1"/>
-      </w:pPr>
-      <w:r>
-        <w:t>Шаг 4. Связать сайт с базой</w:t>
-      </w:r>
-    </w:p>
-    <w:p>
+      <w:pPr>
+        <w:pStyle w:val="ListNumber"/>
+      </w:pPr>
       <w:r>
         <w:rPr>
           <w:rFonts w:ascii="Calibri" w:hAnsi="Calibri"/>
           <w:sz w:val="24"/>
         </w:rPr>
-        <w:t>Откройте командную строку в папке сайта (в Проводнике: адресная строка → напишите cmd → Enter).</w:t>
+        <w:t>Щёлкните по адресной строке сверху (где путь), сотрите путь, напишите cmd и Enter. Откроется чёрное окно, в начале строки уже будет C:\opp-pallet&gt;</w:t>
       </w:r>
     </w:p>
     <w:p>
+      <w:pPr>
+        <w:pStyle w:val="ListNumber"/>
+      </w:pPr>
+      <w:r>
+        <w:rPr>
+          <w:rFonts w:ascii="Calibri" w:hAnsi="Calibri"/>
+          <w:sz w:val="24"/>
+        </w:rPr>
+        <w:t>Введите и нажмите Enter:</w:t>
+      </w:r>
+    </w:p>
+    <w:p>
+      <w:pPr>
+        <w:spacing w:after="160"/>
+      </w:pPr>
       <w:r>
         <w:rPr>
           <w:rFonts w:ascii="Consolas" w:hAnsi="Consolas"/>
           <w:sz w:val="20"/>
         </w:rPr>
         <w:t>npm install</w:t>
-        <w:br/>
+      </w:r>
+    </w:p>
+    <w:p>
+      <w:pPr>
+        <w:spacing w:after="120"/>
+      </w:pPr>
+      <w:r>
+        <w:rPr>
+          <w:rFonts w:ascii="Calibri" w:hAnsi="Calibri"/>
+          <w:b w:val="0"/>
+          <w:sz w:val="24"/>
+        </w:rPr>
+        <w:t>Пойдёт загрузка библиотеки pg (драйвер PostgreSQL). Один раз, интернет нужен. В конце не должно быть слова ERR! Папка node_modules появится сама.</w:t>
+      </w:r>
+    </w:p>
+    <w:p>
+      <w:pPr>
+        <w:spacing w:after="120"/>
+      </w:pPr>
+      <w:r>
+        <w:rPr>
+          <w:rFonts w:ascii="Calibri" w:hAnsi="Calibri"/>
+          <w:b w:val="0"/>
+          <w:sz w:val="24"/>
+        </w:rPr>
+        <w:t>Затем:</w:t>
+      </w:r>
+    </w:p>
+    <w:p>
+      <w:pPr>
+        <w:spacing w:after="160"/>
+      </w:pPr>
+      <w:r>
+        <w:rPr>
+          <w:rFonts w:ascii="Consolas" w:hAnsi="Consolas"/>
+          <w:sz w:val="20"/>
+        </w:rPr>
         <w:t>npm start</w:t>
       </w:r>
     </w:p>
     <w:p>
+      <w:pPr>
+        <w:spacing w:after="120"/>
+      </w:pPr>
+      <w:r>
+        <w:rPr>
+          <w:rFonts w:ascii="Calibri" w:hAnsi="Calibri"/>
+          <w:b w:val="0"/>
+          <w:sz w:val="24"/>
+        </w:rPr>
+        <w:t>Правильный ответ в окне:</w:t>
+      </w:r>
+    </w:p>
+    <w:p>
+      <w:pPr>
+        <w:spacing w:after="160"/>
+      </w:pPr>
+      <w:r>
+        <w:rPr>
+          <w:rFonts w:ascii="Consolas" w:hAnsi="Consolas"/>
+          <w:sz w:val="20"/>
+        </w:rPr>
+        <w:t>ОПП: http://127.0.0.1:8787</w:t>
+        <w:br/>
+        <w:t>Проверка базы: http://127.0.0.1:8787/api.php?action=health</w:t>
+      </w:r>
+    </w:p>
+    <w:p>
+      <w:pPr>
+        <w:spacing w:after="120"/>
+      </w:pPr>
+      <w:r>
+        <w:rPr>
+          <w:rFonts w:ascii="Calibri" w:hAnsi="Calibri"/>
+          <w:b w:val="0"/>
+          <w:sz w:val="24"/>
+        </w:rPr>
+        <w:t>Это окно НЕ сворачивайте крестиком. Можно свернуть в панель. Закроете — сайт и запись в базу умрут.</w:t>
+      </w:r>
+    </w:p>
+    <w:p>
+      <w:pPr>
+        <w:pStyle w:val="Heading1"/>
+      </w:pPr>
+      <w:r>
+        <w:t>Часть 7. Три проверки, что всё связано</w:t>
+      </w:r>
+    </w:p>
+    <w:p>
+      <w:pPr>
+        <w:pStyle w:val="Heading2"/>
+      </w:pPr>
+      <w:r>
+        <w:t>7.1. Сервер отвечает</w:t>
+      </w:r>
+    </w:p>
+    <w:p>
+      <w:pPr>
+        <w:spacing w:after="120"/>
+      </w:pPr>
+      <w:r>
+        <w:rPr>
+          <w:rFonts w:ascii="Calibri" w:hAnsi="Calibri"/>
+          <w:b w:val="0"/>
+          <w:sz w:val="24"/>
+        </w:rPr>
+        <w:t>Откройте Chrome / Edge (не файл с диска, а именно адрес):</w:t>
+      </w:r>
+    </w:p>
+    <w:p>
+      <w:pPr>
+        <w:spacing w:after="160"/>
+      </w:pPr>
+      <w:r>
+        <w:rPr>
+          <w:rFonts w:ascii="Consolas" w:hAnsi="Consolas"/>
+          <w:sz w:val="20"/>
+        </w:rPr>
+        <w:t>http://127.0.0.1:8787/api.php?action=health</w:t>
+      </w:r>
+    </w:p>
+    <w:p>
+      <w:pPr>
+        <w:spacing w:after="120"/>
+      </w:pPr>
+      <w:r>
+        <w:rPr>
+          <w:rFonts w:ascii="Calibri" w:hAnsi="Calibri"/>
+          <w:b w:val="0"/>
+          <w:sz w:val="24"/>
+        </w:rPr>
+        <w:t>Успех: {"ok":true,"db":"postgresql"}</w:t>
+      </w:r>
+    </w:p>
+    <w:p>
+      <w:pPr>
+        <w:spacing w:after="120"/>
+      </w:pPr>
+      <w:r>
+        <w:rPr>
+          <w:rFonts w:ascii="Calibri" w:hAnsi="Calibri"/>
+          <w:b w:val="0"/>
+          <w:sz w:val="24"/>
+        </w:rPr>
+        <w:t>Если страница не открывается — окно npm start не запущено или порт занят.</w:t>
+      </w:r>
+    </w:p>
+    <w:p>
+      <w:pPr>
+        <w:spacing w:after="120"/>
+      </w:pPr>
+      <w:r>
+        <w:rPr>
+          <w:rFonts w:ascii="Calibri" w:hAnsi="Calibri"/>
+          <w:b w:val="0"/>
+          <w:sz w:val="24"/>
+        </w:rPr>
+        <w:t>Если {"ok":false,"error":"server"...} / password authentication failed — опечатка в db-config.json (пароль, user).</w:t>
+      </w:r>
+    </w:p>
+    <w:p>
+      <w:pPr>
+        <w:spacing w:after="120"/>
+      </w:pPr>
+      <w:r>
+        <w:rPr>
+          <w:rFonts w:ascii="Calibri" w:hAnsi="Calibri"/>
+          <w:b w:val="0"/>
+          <w:sz w:val="24"/>
+        </w:rPr>
+        <w:t>Если ECONNREFUSED / connect — служба PostgreSQL не Running (вернитесь к п. 1.9).</w:t>
+      </w:r>
+    </w:p>
+    <w:p>
+      <w:pPr>
+        <w:pStyle w:val="Heading2"/>
+      </w:pPr>
+      <w:r>
+        <w:t>7.2. Сайт открывается</w:t>
+      </w:r>
+    </w:p>
+    <w:p>
+      <w:pPr>
+        <w:spacing w:after="160"/>
+      </w:pPr>
+      <w:r>
+        <w:rPr>
+          <w:rFonts w:ascii="Consolas" w:hAnsi="Consolas"/>
+          <w:sz w:val="20"/>
+        </w:rPr>
+        <w:t>http://127.0.0.1:8787</w:t>
+      </w:r>
+    </w:p>
+    <w:p>
+      <w:pPr>
+        <w:spacing w:after="120"/>
+      </w:pPr>
+      <w:r>
+        <w:rPr>
+          <w:rFonts w:ascii="Calibri" w:hAnsi="Calibri"/>
+          <w:b w:val="0"/>
+          <w:sz w:val="24"/>
+        </w:rPr>
+        <w:t>Должна открыться карточка ФИО по центру, сине-голубой фон. Это локальная копия сайта, не GitHub.</w:t>
+      </w:r>
+    </w:p>
+    <w:p>
+      <w:pPr>
+        <w:pStyle w:val="Heading2"/>
+      </w:pPr>
+      <w:r>
+        <w:t>7.3. Пробный тест реально сел в базу</w:t>
+      </w:r>
+    </w:p>
+    <w:p>
+      <w:pPr>
+        <w:pStyle w:val="ListNumber"/>
+      </w:pPr>
       <w:r>
         <w:rPr>
           <w:rFonts w:ascii="Calibri" w:hAnsi="Calibri"/>
           <w:sz w:val="24"/>
         </w:rPr>
-        <w:t>Должно появиться: ОПП: http://127.0.0.1:8787</w:t>
+        <w:t>Введите учебное ФИО, группу ПРОМРОБО 25-3, пройдите тест (можно отвечать как попало).</w:t>
       </w:r>
     </w:p>
     <w:p>
+      <w:pPr>
+        <w:pStyle w:val="ListNumber"/>
+      </w:pPr>
       <w:r>
         <w:rPr>
           <w:rFonts w:ascii="Calibri" w:hAnsi="Calibri"/>
           <w:sz w:val="24"/>
         </w:rPr>
-        <w:t>Не закрывайте это окно, пока идёт занятие. Закроете — сайт и запись в базу остановятся.</w:t>
-      </w:r>
-    </w:p>
-    <w:p>
-      <w:pPr>
-        <w:pStyle w:val="Heading1"/>
-      </w:pPr>
-      <w:r>
-        <w:t>Шаг 5. Проверка связи</w:t>
+        <w:t>Войдите админом (своё ФИО + пароль). В таблице должна быть строка.</w:t>
       </w:r>
     </w:p>
     <w:p>
@@ -370,7 +1378,28 @@
           <w:rFonts w:ascii="Calibri" w:hAnsi="Calibri"/>
           <w:sz w:val="24"/>
         </w:rPr>
-        <w:t>В браузере откройте http://127.0.0.1:8787/api.php?action=health</w:t>
+        <w:t>pgAdmin → Databases → opp → Schemas → public → Tables → quiz_results → правая кнопка → View/Edit Data → All Rows. Увидите ФИО, процент, дату.</w:t>
+      </w:r>
+    </w:p>
+    <w:p>
+      <w:pPr>
+        <w:spacing w:after="120"/>
+      </w:pPr>
+      <w:r>
+        <w:rPr>
+          <w:rFonts w:ascii="Calibri" w:hAnsi="Calibri"/>
+          <w:b w:val="0"/>
+          <w:sz w:val="24"/>
+        </w:rPr>
+        <w:t>Если в админке пусто, а health был ok: вы открыли сайт с GitHub (poddon.github.io), а не с 127.0.0.1:8787. GitHub не умеет писать в ваш ноутбук.</w:t>
+      </w:r>
+    </w:p>
+    <w:p>
+      <w:pPr>
+        <w:pStyle w:val="Heading1"/>
+      </w:pPr>
+      <w:r>
+        <w:t>Часть 8. Каждый новый урок (короткий ритуал)</w:t>
       </w:r>
     </w:p>
     <w:p>
@@ -382,7 +1411,7 @@
           <w:rFonts w:ascii="Calibri" w:hAnsi="Calibri"/>
           <w:sz w:val="24"/>
         </w:rPr>
-        <w:t>Нужно увидеть {"ok":true,"db":"postgresql"}</w:t>
+        <w:t>Ноутбук в сети (Wi‑Fi аудитории).</w:t>
       </w:r>
     </w:p>
     <w:p>
@@ -394,7 +1423,7 @@
           <w:rFonts w:ascii="Calibri" w:hAnsi="Calibri"/>
           <w:sz w:val="24"/>
         </w:rPr>
-        <w:t>Если ошибка пароля — db-config.json. Если ECONNREFUSED — не запущена служба PostgreSQL (Пуск → services.msc → postgresql-x64-16 → Запустить).</w:t>
+        <w:t>Проверьте в services.msc, что postgresql-x64-16 запущен (обычно стартует сам вместе с Windows).</w:t>
       </w:r>
     </w:p>
     <w:p>
@@ -406,7 +1435,7 @@
           <w:rFonts w:ascii="Calibri" w:hAnsi="Calibri"/>
           <w:sz w:val="24"/>
         </w:rPr>
-        <w:t>Откройте http://127.0.0.1:8787 — это и есть сайт. Пройдите тест учебным ФИО.</w:t>
+        <w:t>cmd в папке сайта → npm start (npm install больше не нужен).</w:t>
       </w:r>
     </w:p>
     <w:p>
@@ -418,67 +1447,63 @@
           <w:rFonts w:ascii="Calibri" w:hAnsi="Calibri"/>
           <w:sz w:val="24"/>
         </w:rPr>
-        <w:t>Зайдите админом. Строка должна быть в таблице. В pgAdmin: база opp → Tables → quiz_results → View/Edit Data.</w:t>
+        <w:t>Свой браузер: http://127.0.0.1:8787</w:t>
       </w:r>
     </w:p>
     <w:p>
       <w:pPr>
-        <w:pStyle w:val="Heading1"/>
-      </w:pPr>
-      <w:r>
-        <w:t>Чтобы заходили другие компьютеры в аудитории</w:t>
-      </w:r>
-    </w:p>
-    <w:p>
+        <w:pStyle w:val="ListNumber"/>
+      </w:pPr>
       <w:r>
         <w:rPr>
           <w:rFonts w:ascii="Calibri" w:hAnsi="Calibri"/>
           <w:sz w:val="24"/>
         </w:rPr>
-        <w:t>Ноутбук преподавателя и студенческие ПК в одной Wi‑Fi/сети. Узнайте IP ноутбука: в cmd команда ipconfig, строка IPv4, например 192.168.1.42. Студенты открывают http://192.168.1.42:8787</w:t>
+        <w:t>Студентам скажите адрес ноутбука, см. часть 9.</w:t>
       </w:r>
     </w:p>
     <w:p>
+      <w:pPr>
+        <w:pStyle w:val="Heading1"/>
+      </w:pPr>
+      <w:r>
+        <w:t>Часть 9. Студенты с других компьютеров</w:t>
+      </w:r>
+    </w:p>
+    <w:p>
+      <w:pPr>
+        <w:pStyle w:val="ListNumber"/>
+      </w:pPr>
       <w:r>
         <w:rPr>
           <w:rFonts w:ascii="Calibri" w:hAnsi="Calibri"/>
           <w:sz w:val="24"/>
         </w:rPr>
-        <w:t>Брандмауэр Windows может спросить разрешение для Node — разрешите в частных сетях. Порт 5432 наружу открывать НЕ нужно, только 8787.</w:t>
+        <w:t>Ноутбук и студенческие ПК в ОДНОЙ сети (один Wi‑Fi, без «гостевой изоляции»).</w:t>
       </w:r>
     </w:p>
     <w:p>
       <w:pPr>
-        <w:pStyle w:val="Heading1"/>
-      </w:pPr>
-      <w:r>
-        <w:t>Как это связано внутри</w:t>
-      </w:r>
-    </w:p>
-    <w:p>
+        <w:pStyle w:val="ListNumber"/>
+      </w:pPr>
       <w:r>
         <w:rPr>
           <w:rFonts w:ascii="Calibri" w:hAnsi="Calibri"/>
           <w:sz w:val="24"/>
         </w:rPr>
-        <w:t>app.js после сдачи вызывает api.php?action=results. server.js перехватывает этот адрес, не отдаёт файл, а делает INSERT в PostgreSQL. Админка вызывает GET того же адреса и получает JSON со всеми строками. Excel собирается уже в браузере из этой таблицы.</w:t>
+        <w:t>На ноутбуке cmd: ipconfig  → строка «IPv4-адрес», например 192.168.0.15</w:t>
       </w:r>
     </w:p>
     <w:p>
+      <w:pPr>
+        <w:pStyle w:val="ListNumber"/>
+      </w:pPr>
       <w:r>
         <w:rPr>
           <w:rFonts w:ascii="Calibri" w:hAnsi="Calibri"/>
           <w:sz w:val="24"/>
         </w:rPr>
-        <w:t>GitHub Pages эту схему не умеет: там нет Node и нет вашей базы. Для занятий с общей таблицей всегда открывайте адрес ноутбука, не github.io.</w:t>
-      </w:r>
-    </w:p>
-    <w:p>
-      <w:pPr>
-        <w:pStyle w:val="Heading1"/>
-      </w:pPr>
-      <w:r>
-        <w:t>macOS (кратко)</w:t>
+        <w:t>Студенты в браузере: http://192.168.0.15:8787  (ваш IP вместо примера).</w:t>
       </w:r>
     </w:p>
     <w:p>
@@ -490,7 +1515,7 @@
           <w:rFonts w:ascii="Calibri" w:hAnsi="Calibri"/>
           <w:sz w:val="24"/>
         </w:rPr>
-        <w:t>brew install postgresql@16 node</w:t>
+        <w:t>Первый запуск Node: брандмауэр Windows спросит доступ — Разрешить в частных сетях.</w:t>
       </w:r>
     </w:p>
     <w:p>
@@ -502,92 +1527,209 @@
           <w:rFonts w:ascii="Calibri" w:hAnsi="Calibri"/>
           <w:sz w:val="24"/>
         </w:rPr>
-        <w:t>brew services start postgresql@16</w:t>
+        <w:t>Порт 5432 в брандмауэре не открывайте. База слушает только ноутбук, снаружи нужна лишь 8787.</w:t>
       </w:r>
     </w:p>
     <w:p>
       <w:pPr>
-        <w:pStyle w:val="ListNumber"/>
+        <w:pStyle w:val="Heading1"/>
+      </w:pPr>
+      <w:r>
+        <w:t>Часть 10. Как это связано «проводами»</w:t>
+      </w:r>
+    </w:p>
+    <w:p>
+      <w:pPr>
+        <w:spacing w:after="120"/>
+      </w:pPr>
+      <w:r>
+        <w:rPr>
+          <w:rFonts w:ascii="Calibri" w:hAnsi="Calibri"/>
+          <w:b w:val="0"/>
+          <w:sz w:val="24"/>
+        </w:rPr>
+        <w:t>1) В synology-config.js написано window.OPP_API = "api.php" — сайт знает, куда постить результат.</w:t>
+      </w:r>
+    </w:p>
+    <w:p>
+      <w:pPr>
+        <w:spacing w:after="120"/>
+      </w:pPr>
+      <w:r>
+        <w:rPr>
+          <w:rFonts w:ascii="Calibri" w:hAnsi="Calibri"/>
+          <w:b w:val="0"/>
+          <w:sz w:val="24"/>
+        </w:rPr>
+        <w:t>2) Студент нажал последний ответ. app.js собирает объект {name, group, pct, ...} и делает fetch("api.php?action=results").</w:t>
+      </w:r>
+    </w:p>
+    <w:p>
+      <w:pPr>
+        <w:spacing w:after="120"/>
+      </w:pPr>
+      <w:r>
+        <w:rPr>
+          <w:rFonts w:ascii="Calibri" w:hAnsi="Calibri"/>
+          <w:b w:val="0"/>
+          <w:sz w:val="24"/>
+        </w:rPr>
+        <w:t>3) server.js видит путь /api.php, не ищет файл, а выполняет SQL INSERT в таблицу quiz_results.</w:t>
+      </w:r>
+    </w:p>
+    <w:p>
+      <w:pPr>
+        <w:spacing w:after="120"/>
+      </w:pPr>
+      <w:r>
+        <w:rPr>
+          <w:rFonts w:ascii="Calibri" w:hAnsi="Calibri"/>
+          <w:b w:val="0"/>
+          <w:sz w:val="24"/>
+        </w:rPr>
+        <w:t>4) Админка делает GET api.php?action=results — server.js отвечает JSON-списком строк. Таблица на экране и кнопка Excel берут уже этот список.</w:t>
+      </w:r>
+    </w:p>
+    <w:p>
+      <w:pPr>
+        <w:spacing w:after="120"/>
+      </w:pPr>
+      <w:r>
+        <w:rPr>
+          <w:rFonts w:ascii="Calibri" w:hAnsi="Calibri"/>
+          <w:b w:val="0"/>
+          <w:sz w:val="24"/>
+        </w:rPr>
+        <w:t>5) Списывание на сервер не отправляется — так задумано.</w:t>
+      </w:r>
+    </w:p>
+    <w:p>
+      <w:pPr>
+        <w:pStyle w:val="Heading1"/>
+      </w:pPr>
+      <w:r>
+        <w:t>Если сломалось</w:t>
+      </w:r>
+    </w:p>
+    <w:p>
+      <w:pPr>
+        <w:pStyle w:val="ListBullet"/>
       </w:pPr>
       <w:r>
         <w:rPr>
           <w:rFonts w:ascii="Calibri" w:hAnsi="Calibri"/>
           <w:sz w:val="24"/>
         </w:rPr>
-        <w:t>createdb opp</w:t>
+        <w:t>«node не является командой» — Node не установлен или cmd открыт со времён до установки. Закройте окно, откройте новое.</w:t>
       </w:r>
     </w:p>
     <w:p>
       <w:pPr>
-        <w:pStyle w:val="ListNumber"/>
+        <w:pStyle w:val="ListBullet"/>
       </w:pPr>
       <w:r>
         <w:rPr>
           <w:rFonts w:ascii="Calibri" w:hAnsi="Calibri"/>
           <w:sz w:val="24"/>
         </w:rPr>
-        <w:t>Дальше так же: db-config.json, npm install, npm start.</w:t>
+        <w:t>«Нет db-config.json» — не переименовали example.</w:t>
       </w:r>
     </w:p>
     <w:p>
       <w:pPr>
-        <w:pStyle w:val="Heading1"/>
-      </w:pPr>
-      <w:r>
-        <w:t>Частые ошибки</w:t>
-      </w:r>
-    </w:p>
-    <w:p>
-      <w:pPr>
-        <w:pStyle w:val="ListNumber"/>
+        <w:pStyle w:val="ListBullet"/>
       </w:pPr>
       <w:r>
         <w:rPr>
           <w:rFonts w:ascii="Calibri" w:hAnsi="Calibri"/>
           <w:sz w:val="24"/>
         </w:rPr>
-        <w:t>Открыли сайт с GitHub, а сервер на ноутбуке — браузер не пустит запрос на другой адрес. Открывайте только http://127.0.0.1:8787</w:t>
+        <w:t>password authentication failed — пароль в JSON не тот, что при установке PostgreSQL. Часто путают пароль pgAdmin и пароль postgres.</w:t>
       </w:r>
     </w:p>
     <w:p>
       <w:pPr>
-        <w:pStyle w:val="ListNumber"/>
+        <w:pStyle w:val="ListBullet"/>
       </w:pPr>
       <w:r>
         <w:rPr>
           <w:rFonts w:ascii="Calibri" w:hAnsi="Calibri"/>
           <w:sz w:val="24"/>
         </w:rPr>
-        <w:t>Окно npm start закрыли.</w:t>
+        <w:t>Порт 8787 занят — в cmd:  set OPP_PORT=8790  и снова npm start. Тогда адрес http://127.0.0.1:8790</w:t>
       </w:r>
     </w:p>
     <w:p>
       <w:pPr>
-        <w:pStyle w:val="ListNumber"/>
+        <w:pStyle w:val="ListBullet"/>
       </w:pPr>
       <w:r>
         <w:rPr>
           <w:rFonts w:ascii="Calibri" w:hAnsi="Calibri"/>
           <w:sz w:val="24"/>
         </w:rPr>
-        <w:t>В db-config.json остался текст СЮДА_ПАРОЛЬ_ИЗ_УСТАНОВКИ.</w:t>
+        <w:t>Сайт открыли как файл C:\opp-pallet\index.html — так API не работает. Только через http://127.0.0.1:8787</w:t>
       </w:r>
     </w:p>
     <w:p>
       <w:pPr>
-        <w:pStyle w:val="ListNumber"/>
+        <w:pStyle w:val="ListBullet"/>
       </w:pPr>
       <w:r>
         <w:rPr>
           <w:rFonts w:ascii="Calibri" w:hAnsi="Calibri"/>
           <w:sz w:val="24"/>
         </w:rPr>
-        <w:t>Пользователь в конфиге не postgres, а opp — тогда сначала создайте этого пользователя в psql.</w:t>
+        <w:t>Русские буквы в пути C:\Пользователи\...\сайт — лучше перенести в C:\opp-pallet</w:t>
+      </w:r>
+    </w:p>
+    <w:p>
+      <w:pPr>
+        <w:pStyle w:val="Heading1"/>
+      </w:pPr>
+      <w:r>
+        <w:t>Что не делать</w:t>
+      </w:r>
+    </w:p>
+    <w:p>
+      <w:pPr>
+        <w:pStyle w:val="ListBullet"/>
+      </w:pPr>
+      <w:r>
+        <w:rPr>
+          <w:rFonts w:ascii="Calibri" w:hAnsi="Calibri"/>
+          <w:sz w:val="24"/>
+        </w:rPr>
+        <w:t>Не выкладывайте db-config.json в интернет и в GitHub — там пароль.</w:t>
+      </w:r>
+    </w:p>
+    <w:p>
+      <w:pPr>
+        <w:pStyle w:val="ListBullet"/>
+      </w:pPr>
+      <w:r>
+        <w:rPr>
+          <w:rFonts w:ascii="Calibri" w:hAnsi="Calibri"/>
+          <w:sz w:val="24"/>
+        </w:rPr>
+        <w:t>Не публикуйте 5432 на роутере.</w:t>
+      </w:r>
+    </w:p>
+    <w:p>
+      <w:pPr>
+        <w:pStyle w:val="ListBullet"/>
+      </w:pPr>
+      <w:r>
+        <w:rPr>
+          <w:rFonts w:ascii="Calibri" w:hAnsi="Calibri"/>
+          <w:sz w:val="24"/>
+        </w:rPr>
+        <w:t>Не оставляйте занятие с npm start, если ноутбук уносите: сначала закройте окно (Ctrl+C).</w:t>
       </w:r>
     </w:p>
     <w:sectPr>
       <w:pgSz w:w="12240" w:h="15840"/>
-      <w:pgMar w:top="1134" w:right="1247" w:bottom="1134" w:left="1247" w:header="720" w:footer="720" w:gutter="0"/>
+      <w:pgMar w:top="1020" w:right="1134" w:bottom="1020" w:left="1134" w:header="720" w:footer="720" w:gutter="0"/>
       <w:cols w:space="720"/>
       <w:docGrid w:linePitch="360"/>
     </w:sectPr>

</xml_diff>